<commit_message>
fake service for inject and show list
</commit_message>
<xml_diff>
--- a/docs.docx
+++ b/docs.docx
@@ -5,7 +5,6 @@
     <w:p>
       <w:pPr>
         <w:rPr>
-          <w:rFonts w:hint="cs"/>
           <w:rtl/>
         </w:rPr>
       </w:pPr>
@@ -20,7 +19,6 @@
     <w:p>
       <w:pPr>
         <w:rPr>
-          <w:rFonts w:hint="cs"/>
           <w:rtl/>
         </w:rPr>
       </w:pPr>
@@ -35,7 +33,6 @@
     <w:p>
       <w:pPr>
         <w:rPr>
-          <w:rFonts w:hint="cs"/>
           <w:rtl/>
         </w:rPr>
       </w:pPr>
@@ -51,13 +48,8 @@
       <w:pPr>
         <w:bidi w:val="0"/>
       </w:pPr>
-      <w:proofErr w:type="spellStart"/>
-      <w:r>
-        <w:t>npm</w:t>
-      </w:r>
-      <w:proofErr w:type="spellEnd"/>
-      <w:r>
-        <w:t xml:space="preserve"> install -g @angular/cli</w:t>
+      <w:r>
+        <w:t>npm install -g @angular/cli</w:t>
       </w:r>
     </w:p>
     <w:p>
@@ -92,7 +84,6 @@
     <w:p>
       <w:pPr>
         <w:rPr>
-          <w:rFonts w:hint="cs"/>
           <w:rtl/>
         </w:rPr>
       </w:pPr>
@@ -109,15 +100,50 @@
         <w:bidi w:val="0"/>
       </w:pPr>
       <w:r>
-        <w:t xml:space="preserve">ng </w:t>
-      </w:r>
-      <w:proofErr w:type="gramStart"/>
-      <w:r>
-        <w:t>generate</w:t>
-      </w:r>
-      <w:proofErr w:type="gramEnd"/>
-      <w:r>
-        <w:t xml:space="preserve"> component home</w:t>
+        <w:t>ng generate component home</w:t>
+      </w:r>
+    </w:p>
+    <w:p>
+      <w:pPr>
+        <w:rPr>
+          <w:rFonts w:hint="cs"/>
+          <w:rtl/>
+        </w:rPr>
+      </w:pPr>
+      <w:r>
+        <w:rPr>
+          <w:rFonts w:hint="cs"/>
+          <w:rtl/>
+        </w:rPr>
+        <w:t>وقتی میخوای از یه کامپوننتی استفاده کنی اونو ایمپورت کن وگرنه وارنینگ میده. فکر کنم توی تمپلت این لاین حتی خطا هم میده</w:t>
+      </w:r>
+    </w:p>
+    <w:p>
+      <w:pPr>
+        <w:rPr>
+          <w:rFonts w:hint="cs"/>
+          <w:rtl/>
+        </w:rPr>
+      </w:pPr>
+      <w:r>
+        <w:t>RouterOutlet</w:t>
+      </w:r>
+      <w:r>
+        <w:rPr>
+          <w:rFonts w:hint="cs"/>
+          <w:rtl/>
+        </w:rPr>
+        <w:t xml:space="preserve"> برای </w:t>
+      </w:r>
+      <w:r>
+        <w:t>routing</w:t>
+      </w:r>
+      <w:r>
+        <w:rPr>
+          <w:rFonts w:hint="cs"/>
+          <w:rtl/>
+        </w:rPr>
+        <w:t xml:space="preserve"> عه</w:t>
       </w:r>
     </w:p>
     <w:p>

</xml_diff>